<commit_message>
Automate full case study processing with OpenAI and Word document generation
</commit_message>
<xml_diff>
--- a/generated_case_studies/Patriot_case_study.docx
+++ b/generated_case_studies/Patriot_case_study.docx
@@ -22,84 +22,86 @@
         <w:t>### 1. Client Overview</w:t>
         <w:br/>
         <w:br/>
-        <w:t>Patriot Family Insurance engaged COI to develop furniture and workspace solutions for its Nashua office renovation. The documented project quote includes private-office desks, mobile file cabinets, a conference table, conference chairs, and estimated installation services.</w:t>
+        <w:t>Patriot Family Insurance engaged COI to explore furniture and workspace solutions for the renovation of its Nashua office. The office encompasses approximately 11,000 square feet and supports a sales-focused workforce.</w:t>
         <w:br/>
         <w:br/>
-        <w:t>In parallel, COI and Patriot discussed a broader workplace plan involving sales workstations, private offices, administrative space, a lounge area, furniture decommissioning, installation, and potential electrical and data work. Several elements of this broader plan remained subject to design review, site evaluation, pricing, and client approval.</w:t>
+        <w:t>The supplied quote, dated August 11, 2026, covers private-office and conference-room furniture with an estimated project total of **$12,900.00**. Broader workstation, decommissioning, technology, and infrastructure requirements were also discussed but are not included as line items in the supplied quote.</w:t>
         <w:br/>
         <w:br/>
         <w:t>### 2. Project Challenge</w:t>
         <w:br/>
         <w:br/>
-        <w:t>Patriot’s existing office contained larger cubicles originally configured for engineers. Because the Nashua location functions as a sales office, Patriot wanted smaller workstations that could accommodate two monitors and a notebook without making the space feel overcrowded or overly uniform.</w:t>
+        <w:t>Patriot wanted to replace larger cubicles originally configured for engineers with smaller workstations suited to sales agents. Each sales station needed enough room for two monitors and a notebook without making the office feel overcrowded or overly uniform.</w:t>
         <w:br/>
         <w:br/>
-        <w:t>At the discovery stage, Patriot reported approximately 45 agents and a goal of reaching 90 agents within six to 12 months. Later in the process, Patriot confirmed that the suite’s maximum building occupancy was 110 people. A design concept showed 105 workstation seats, but the team discussed reducing that concept by 15 stations to a working target of 90, allowing for private offices and administrative personnel. This reduction was still part of the design-refinement process rather than a documented final quantity in the provided quote.</w:t>
+        <w:t>Headcount and occupancy were central to the planning process:</w:t>
+        <w:br/>
+        <w:br/>
+        <w:t>- Patriot reported approximately **45 agents** during discovery and indicated it was hiring agents **47, 48, and 49**.</w:t>
+        <w:br/>
+        <w:t>- The stated growth goal was to double from **45 agents to 90 agents over the following 6 to 12 months**.</w:t>
+        <w:br/>
+        <w:t>- An early COI layout demonstrated a maximum of **130 workstation seats**, excluding private offices. This was a design capacity study, not the selected quantity.</w:t>
+        <w:br/>
+        <w:t>- The building later confirmed a maximum occupancy of **110 people** within Patriot’s suite.</w:t>
+        <w:br/>
+        <w:t>- By the final review, the active design contained approximately **105 seats**. Patriot indicated that **90 workstations** might be more appropriate because private offices and administrative personnel would also count toward suite occupancy. A final reduction was still pending.</w:t>
         <w:br/>
         <w:br/>
         <w:t>Additional project considerations included:</w:t>
         <w:br/>
         <w:br/>
-        <w:t>- Maintaining practical aisles and circulation throughout the office.</w:t>
+        <w:t>- Preserving comfortable aisles and circulation routes.</w:t>
         <w:br/>
-        <w:t>- Avoiding the secluded feeling created by the existing approximately 67-inch-high panels.</w:t>
+        <w:t>- Avoiding tall panels that made employees feel secluded.</w:t>
         <w:br/>
-        <w:t>- Managing increased conversation levels as staffing approached 70, 80, or 90 agents.</w:t>
+        <w:t>- Managing higher noise levels as the sales team expanded.</w:t>
         <w:br/>
-        <w:t>- Expanding from approximately 46 existing Ethernet connections to support a substantially larger workforce.</w:t>
+        <w:t>- Expanding from the existing **46 Ethernet connections** to support the future workstation plan.</w:t>
         <w:br/>
-        <w:t>- Determining how power and data would reach new workstation rows around existing ceiling lights, vents, columns, and other building conditions.</w:t>
+        <w:t>- Providing sufficient electrical service for the increased workstation count.</w:t>
         <w:br/>
-        <w:t>- Preserving enough desk space for dual monitors and day-to-day sales work.</w:t>
+        <w:t>- Coordinating furniture decommissioning, delivery, installation, data, and electrical work.</w:t>
         <w:br/>
-        <w:t>- Coordinating the removal of existing systems furniture and installation of new furniture while limiting workplace disruption.</w:t>
-        <w:br/>
-        <w:t>- Reviewing whether monitors should be standardized and supplied as part of the project.</w:t>
+        <w:t>- Determining how to maintain operations during the furniture transition.</w:t>
         <w:br/>
         <w:br/>
         <w:t>### 3. COI Solution</w:t>
         <w:br/>
         <w:br/>
-        <w:t>COI developed straight-row tele-station concepts intended to use the available floor area efficiently while simplifying power and data distribution. These concepts were presented as alternatives to a more complex pod-style layout. Straight workstation runs could allow power and data to travel through connected panel systems, with base feeds or power poles used where required.</w:t>
+        <w:t>COI developed workstation concepts that prioritized efficient space use and simpler power and data distribution. The proposed approach used rows of facing **tele-stations**, allowing power and data to run through connected panel systems rather than requiring a separate connection at every location.</w:t>
         <w:br/>
         <w:br/>
-        <w:t>The broader concept included full furniture decommissioning and installation. COI discussed completing the work in phases or during a period when Patriot’s employees could work remotely for approximately one week. The final implementation method was not documented as complete or approved.</w:t>
+        <w:t>The broader concept discussed during design review included:</w:t>
         <w:br/>
         <w:br/>
-        <w:t>COI also proposed or recommended the following:</w:t>
+        <w:t>- Reducing the active workstation plan from approximately **105 seats to 90 workstations**, subject to final layout revisions.</w:t>
+        <w:br/>
+        <w:t>- Decommissioning the existing cubicle systems before installing new furniture.</w:t>
+        <w:br/>
+        <w:t>- Allowing Patriot’s team to work remotely during the transition to reduce disruption.</w:t>
+        <w:br/>
+        <w:t>- Using lower workstation panels to improve visibility across the office.</w:t>
+        <w:br/>
+        <w:t>- Offering glass stackers as an optional design feature that could be removed to reduce cost or added later.</w:t>
+        <w:br/>
+        <w:t>- Providing mobile file cabinets where needed, with the option to purchase fewer initially and add more later.</w:t>
+        <w:br/>
+        <w:t>- Considering taller panels or a sound-masking solution to help manage speech and background noise.</w:t>
+        <w:br/>
+        <w:t>- Conducting a separate evaluation of electrical and data requirements after the workstation quantity and layout were finalized.</w:t>
         <w:br/>
         <w:br/>
-        <w:t>- Lower workstation panels to improve visibility across the office.</w:t>
-        <w:br/>
-        <w:t>- Optional clear or frosted glass stackers to create a more refined appearance.</w:t>
-        <w:br/>
-        <w:t>- Taller panels as an alternative where additional sound mitigation was preferred.</w:t>
-        <w:br/>
-        <w:t>- Sound masking as a recommended option for reducing the impact of conversations in the sales areas and near offices where privacy may be important.</w:t>
-        <w:br/>
-        <w:t>- Monitor arms as an optional ergonomic solution that would also free usable desk space.</w:t>
-        <w:br/>
-        <w:t>- Mobile file cabinets that could be reduced in quantity initially and added later if needed.</w:t>
-        <w:br/>
-        <w:t>- Planters and planter-style bookcases to introduce greenery, visual separation, and storage.</w:t>
-        <w:br/>
-        <w:t>- A height-adjustable L-shaped desk concept for the executive office.</w:t>
-        <w:br/>
-        <w:t>- Wardrobe and filing storage for the executive and administrative areas.</w:t>
-        <w:br/>
-        <w:t>- A separate electrical and data assessment after the final workstation count and layout were established.</w:t>
-        <w:br/>
-        <w:br/>
-        <w:t>Electrical, data, Wi-Fi, sound masking, monitors, and other technology-related components were discussed but are not included as confirmed line items in the provided quote.</w:t>
+        <w:t>COI also proposed designs for an executive office, an administrative workspace, and a small lounge area. These concepts included a height-adjustable L-shaped desk, storage, meeting seating, tack boards, wardrobes, planter-style bookcases, lounge chairs, and monitor arms. These broader concepts were discussed during design review but are not documented as final selections in the supplied quote.</w:t>
         <w:br/>
         <w:br/>
         <w:t>### 4. Products and Design Decisions</w:t>
         <w:br/>
         <w:br/>
-        <w:t>#### Documented Quote</w:t>
+        <w:t>#### Quoted Products</w:t>
         <w:br/>
         <w:br/>
-        <w:t>The August 11, 2026 quote identifies the following products:</w:t>
+        <w:t>The supplied quote documents the following products:</w:t>
         <w:br/>
         <w:br/>
         <w:t>| Product | Quantity | Unit Price | Total |</w:t>
@@ -119,81 +121,68 @@
         <w:br/>
         <w:t xml:space="preserve">**Estimated Installation:** $1,500.00  </w:t>
         <w:br/>
-        <w:t xml:space="preserve">**Estimated Project Total:** $12,900.00  </w:t>
+        <w:t>**Estimated Project Total:** $12,900.00</w:t>
         <w:br/>
         <w:br/>
-        <w:t>The quote notes that final quantities and pricing are subject to approval and that furniture selections may change during the final design review.</w:t>
+        <w:t>Final quantities and pricing remain subject to approval, and the quote notes that furniture selections may change during the final design review.</w:t>
         <w:br/>
         <w:br/>
-        <w:t>#### Proposed and Pending Design Decisions</w:t>
+        <w:t>#### Proposed or Pending Design Decisions</w:t>
         <w:br/>
         <w:br/>
-        <w:t>The broader design discussions included the following proposed or optional elements:</w:t>
+        <w:t>The following items were discussed but were not confirmed as final in the supplied materials:</w:t>
         <w:br/>
         <w:br/>
-        <w:t>- A working reduction from a 105-workstation concept to 90 workstations, subject to final design confirmation.</w:t>
+        <w:t>- Approximately **90 sales workstations**, reduced from the approximately **105 seats** shown during final review.</w:t>
         <w:br/>
-        <w:t>- Static workstation surfaces for the sales team rather than height-adjustable desks.</w:t>
+        <w:t>- Lower workstation panels to maintain visibility across the office.</w:t>
         <w:br/>
-        <w:t>- Space for two monitors and a notebook at each sales workstation.</w:t>
+        <w:t>- Clear, frosted, or other glass stacker options above workstation panels.</w:t>
         <w:br/>
-        <w:t>- Lower panels than the existing approximately 67-inch panels.</w:t>
+        <w:t>- Patriot’s darker blue and red brand colors within the executive-office concept.</w:t>
         <w:br/>
-        <w:t>- A concept using panels around 36 to 42 inches high, with optional glass stackers.</w:t>
+        <w:t>- Dual-monitor capacity at workstations.</w:t>
         <w:br/>
-        <w:t>- Another reviewed configuration using a 50-inch panel with 10 inches of glass, totaling five feet; COI noted that the panel height could be reduced.</w:t>
+        <w:t>- Commercial-grade task chairs and monitor arms.</w:t>
         <w:br/>
-        <w:t>- Clear or frosted glass options, with glass removable to reduce cost or addable later.</w:t>
+        <w:t>- Optional mobile storage at individual workstations.</w:t>
         <w:br/>
-        <w:t>- Mobile under-desk file cabinets, with the quantity adjustable based on storage requirements.</w:t>
+        <w:t>- Planters and greenery to break up long workstation rows.</w:t>
         <w:br/>
-        <w:t>- Dual-monitor or triple-monitor capability in the executive and administrative areas.</w:t>
+        <w:t>- Sound masking for the open office and potentially near administrative spaces.</w:t>
         <w:br/>
-        <w:t>- A proposed executive office with a height-adjustable L-shaped desk, darker blue and red accents associated with Patriot’s colors, a small round meeting table, wardrobe storage, filing, and tack boards.</w:t>
+        <w:t>- Training-room tables and seating concepts.</w:t>
         <w:br/>
-        <w:t>- A proposed administrative area with storage, a wardrobe, planter-style bookcases, and workspace for document handoffs and employee questions.</w:t>
+        <w:t>- Approximately **200 monitors**, estimated during discussion at **$20,000 to $30,000 depending on style**. This remained under consideration and was not included in the supplied quote.</w:t>
         <w:br/>
-        <w:t>- A proposed lounge area with two chairs near the kitchenette.</w:t>
+        <w:t>- Separate electrical and data services, pending an on-site assessment and additional pricing.</w:t>
         <w:br/>
-        <w:t>- Training tables and associated seating concepts to be developed separately.</w:t>
-        <w:br/>
-        <w:t>- Optional standardized monitors. COI discussed supplying and installing them, but Patriot had not made a final decision.</w:t>
-        <w:br/>
-        <w:t>- Final finish selections to be reviewed in person and applied to a final rendering.</w:t>
-        <w:br/>
-        <w:br/>
-        <w:t>The quote’s four private-office desks, four mobile file cabinets, one conference-room table, and eight conference chairs are the only products with documented quantities and pricing in the supplied quote. The broader workstation and ancillary concepts remained outside that itemized quote or pending further approval.</w:t>
+        <w:t>- Relocation and mounting of an existing office television, subject to confirming nearby power and data requirements.</w:t>
         <w:br/>
         <w:br/>
         <w:t>### 5. Project Results</w:t>
         <w:br/>
         <w:br/>
-        <w:t>The provided information does not confirm that the renovation, furniture delivery, decommissioning, or installation has been completed. No post-installation results, performance measures, employee feedback, or final photography were provided.</w:t>
+        <w:t>The supplied information does not confirm that the Nashua office renovation has been completed. No documented installation results, final workstation count, completed photography, employee feedback, or measurable post-project outcomes were provided.</w:t>
         <w:br/>
         <w:br/>
-        <w:t>Accordingly, the documented outcome at this stage is a developed design direction and a quoted furniture package with an estimated project total of $12,900, subject to final approval and design review.</w:t>
+        <w:t>The available records reflect discovery, design development, final-review discussions, and a sample quote dated August 11, 2026.</w:t>
         <w:br/>
         <w:br/>
         <w:t>### 6. Key Takeaways</w:t>
         <w:br/>
         <w:br/>
-        <w:t>- Patriot sought to replace large, engineer-oriented cubicles with smaller sales workstations designed for two monitors and a notebook.</w:t>
+        <w:t>- Patriot’s primary objective was to replace oversized cubicles with smaller sales workstations that support two monitors and a notebook.</w:t>
         <w:br/>
-        <w:t>- The initial growth goal was to move from approximately 45 agents to 90 agents within six to 12 months.</w:t>
+        <w:t>- The planning process evolved from a **130-workstation maximum-capacity concept** to an approximately **105-seat design**, with a potential reduction to **90 workstations** after the suite’s **110-person maximum occupancy** was confirmed.</w:t>
         <w:br/>
-        <w:t>- The suite’s confirmed maximum building occupancy was 110 people.</w:t>
+        <w:t>- COI proposed a connected tele-station layout to improve space efficiency and simplify power and data distribution.</w:t>
         <w:br/>
-        <w:t>- A later concept showed 105 workstation seats, with a proposed reduction of 15 stations to reach a working target of 90 and preserve capacity for offices and administrative staff.</w:t>
+        <w:t>- Visibility, circulation, acoustics, storage, technology, and installation logistics were important parts of the design discussion.</w:t>
         <w:br/>
-        <w:t>- COI proposed a straight-row tele-station layout to support circulation and simplify power and data distribution.</w:t>
+        <w:t>- The supplied quote totals **$12,900.00** and includes four private office desks, four mobile file cabinets, one conference room table, eight conference chairs, and estimated installation.</w:t>
         <w:br/>
-        <w:t>- Lower panels, optional glass, sound masking, monitor arms, mobile storage, planters, and standardized monitors were discussed as configurable or pending elements.</w:t>
-        <w:br/>
-        <w:t>- Electrical and data requirements were to be evaluated separately after confirming the final workstation count and layout.</w:t>
-        <w:br/>
-        <w:t>- The documented quote includes four private-office desks, four mobile file cabinets, one conference-room table, eight conference chairs, and estimated installation, for an estimated total of $12,900.</w:t>
-        <w:br/>
-        <w:t>- Project completion and measurable results have not been documented.</w:t>
+        <w:t>- The broader workstation package, decommissioning scope, sound masking, monitors, and electrical and data work remained subject to further design decisions, evaluation, pricing, and approval.</w:t>
       </w:r>
     </w:p>
     <w:sectPr>

</xml_diff>

<commit_message>
Test multi-meeting Fathom workflow and add debugging
</commit_message>
<xml_diff>
--- a/generated_case_studies/Patriot_case_study.docx
+++ b/generated_case_studies/Patriot_case_study.docx
@@ -22,86 +22,83 @@
         <w:t>### 1. Client Overview</w:t>
         <w:br/>
         <w:br/>
-        <w:t>Patriot Family Insurance engaged COI to explore furniture and workspace solutions for the renovation of its Nashua office. The office encompasses approximately 11,000 square feet and supports a sales-focused workforce.</w:t>
+        <w:t>Patriot Family Insurance engaged COI to develop furniture and workspace solutions for its Nashua office renovation. The project discussions addressed a broader office-wide plan for workstations, private offices, administrative space, a lounge, technology coordination, and installation.</w:t>
         <w:br/>
         <w:br/>
-        <w:t>The supplied quote, dated August 11, 2026, covers private-office and conference-room furniture with an estimated project total of **$12,900.00**. Broader workstation, decommissioning, technology, and infrastructure requirements were also discussed but are not included as line items in the supplied quote.</w:t>
+        <w:t>The provided project quote, dated August 11, 2026, documents a defined furniture package for private offices and a conference room, with an estimated project total of **$12,900.00**.</w:t>
         <w:br/>
         <w:br/>
         <w:t>### 2. Project Challenge</w:t>
         <w:br/>
         <w:br/>
-        <w:t>Patriot wanted to replace larger cubicles originally configured for engineers with smaller workstations suited to sales agents. Each sales station needed enough room for two monitors and a notebook without making the office feel overcrowded or overly uniform.</w:t>
+        <w:t>Patriot wanted to replace its existing large, engineering-style cubicles with smaller workstations better suited to a sales office. Each sales station needed enough space for two monitors, a keyboard or notebook, and limited paperwork without making the office feel crowded or overly uniform.</w:t>
         <w:br/>
         <w:br/>
-        <w:t>Headcount and occupancy were central to the planning process:</w:t>
+        <w:t>Several headcount and occupancy figures shaped the planning process:</w:t>
         <w:br/>
         <w:br/>
-        <w:t>- Patriot reported approximately **45 agents** during discovery and indicated it was hiring agents **47, 48, and 49**.</w:t>
+        <w:t>- Patriot reported approximately **45 agents** at the time of discovery and was hiring agents **47, 48, and 49**.</w:t>
         <w:br/>
-        <w:t>- The stated growth goal was to double from **45 agents to 90 agents over the following 6 to 12 months**.</w:t>
+        <w:t>- The stated goal was to reach **90 agents within six to twelve months**, effectively doubling the team from 45.</w:t>
         <w:br/>
-        <w:t>- An early COI layout demonstrated a maximum of **130 workstation seats**, excluding private offices. This was a design capacity study, not the selected quantity.</w:t>
+        <w:t>- Early COI concepts explored a theoretical maximum of up to **132 workstations**.</w:t>
         <w:br/>
-        <w:t>- The building later confirmed a maximum occupancy of **110 people** within Patriot’s suite.</w:t>
+        <w:t>- A subsequent maximum-density concept showed **130 cubicle seats**, excluding private offices.</w:t>
         <w:br/>
-        <w:t>- By the final review, the active design contained approximately **105 seats**. Patriot indicated that **90 workstations** might be more appropriate because private offices and administrative personnel would also count toward suite occupancy. A final reduction was still pending.</w:t>
+        <w:t>- The building later confirmed a maximum occupancy of **110 people in Patriot’s suite**.</w:t>
+        <w:br/>
+        <w:t>- By the final review, the developed plan contained **105 seats**, but Patriot indicated that approximately **90 workstations** would be more appropriate once private offices and administrative personnel were considered. COI therefore proposed removing 15 stations from that version of the plan.</w:t>
         <w:br/>
         <w:br/>
-        <w:t>Additional project considerations included:</w:t>
+        <w:t>Patriot also wanted lower workstation partitions than its existing approximately **67-inch panels**. The goal was to improve visibility across the office while still addressing the increased noise expected from a larger sales team.</w:t>
         <w:br/>
         <w:br/>
-        <w:t>- Preserving comfortable aisles and circulation routes.</w:t>
-        <w:br/>
-        <w:t>- Avoiding tall panels that made employees feel secluded.</w:t>
-        <w:br/>
-        <w:t>- Managing higher noise levels as the sales team expanded.</w:t>
-        <w:br/>
-        <w:t>- Expanding from the existing **46 Ethernet connections** to support the future workstation plan.</w:t>
-        <w:br/>
-        <w:t>- Providing sufficient electrical service for the increased workstation count.</w:t>
-        <w:br/>
-        <w:t>- Coordinating furniture decommissioning, delivery, installation, data, and electrical work.</w:t>
-        <w:br/>
-        <w:t>- Determining how to maintain operations during the furniture transition.</w:t>
+        <w:t>Technology infrastructure was another consideration. The existing office had Ethernet and electrical connections supporting approximately **46 stations**, while the renovation discussions contemplated significantly more workstations. The final data and electrical requirements could not be established until the workstation quantity and layout were confirmed.</w:t>
         <w:br/>
         <w:br/>
         <w:t>### 3. COI Solution</w:t>
         <w:br/>
         <w:br/>
-        <w:t>COI developed workstation concepts that prioritized efficient space use and simpler power and data distribution. The proposed approach used rows of facing **tele-stations**, allowing power and data to run through connected panel systems rather than requiring a separate connection at every location.</w:t>
+        <w:t>COI developed workstation layouts intended to improve capacity, circulation, and access to power and data. Straight tele-station configurations were proposed as a more efficient alternative to pod-style arrangements because they could simplify electrical and data distribution while preserving clearer aisles.</w:t>
         <w:br/>
         <w:br/>
-        <w:t>The broader concept discussed during design review included:</w:t>
+        <w:t>The broader solution discussed by COI included:</w:t>
         <w:br/>
         <w:br/>
-        <w:t>- Reducing the active workstation plan from approximately **105 seats to 90 workstations**, subject to final layout revisions.</w:t>
+        <w:t>- Decommissioning the existing cubicle systems.</w:t>
         <w:br/>
-        <w:t>- Decommissioning the existing cubicle systems before installing new furniture.</w:t>
+        <w:t>- Installing new workstation furniture.</w:t>
         <w:br/>
-        <w:t>- Allowing Patriot’s team to work remotely during the transition to reduce disruption.</w:t>
+        <w:t>- Designing compact stations around the needs of a sales team.</w:t>
         <w:br/>
-        <w:t>- Using lower workstation panels to improve visibility across the office.</w:t>
+        <w:t>- Configuring stations to accommodate dual monitors.</w:t>
         <w:br/>
-        <w:t>- Offering glass stackers as an optional design feature that could be removed to reduce cost or added later.</w:t>
+        <w:t>- Including commercial-grade task seating in the broader workstation concept.</w:t>
         <w:br/>
-        <w:t>- Providing mobile file cabinets where needed, with the option to purchase fewer initially and add more later.</w:t>
+        <w:t>- Coordinating furniture installation.</w:t>
         <w:br/>
-        <w:t>- Considering taller panels or a sound-masking solution to help manage speech and background noise.</w:t>
+        <w:t>- Evaluating electrical and data requirements after the workstation count was finalized.</w:t>
         <w:br/>
-        <w:t>- Conducting a separate evaluation of electrical and data requirements after the workstation quantity and layout were finalized.</w:t>
+        <w:t>- Exploring lower partitions with optional glass stackers.</w:t>
+        <w:br/>
+        <w:t>- Using planters in selected areas to provide visual separation, greenery, and color.</w:t>
+        <w:br/>
+        <w:t>- Developing concepts for private executive and administrative spaces.</w:t>
         <w:br/>
         <w:br/>
-        <w:t>COI also proposed designs for an executive office, an administrative workspace, and a small lounge area. These concepts included a height-adjustable L-shaped desk, storage, meeting seating, tack boards, wardrobes, planter-style bookcases, lounge chairs, and monitor arms. These broader concepts were discussed during design review but are not documented as final selections in the supplied quote.</w:t>
+        <w:t>COI recommended sound masking as a potential solution for managing conversational noise in the higher-density sales areas. Zoned sound masking was discussed as an option for both the open office and areas near administrative offices, but it was not confirmed as part of the provided quote.</w:t>
+        <w:br/>
+        <w:br/>
+        <w:t>Electrical and data work remained pending a site evaluation and was expected to be addressed through a separate quote. Potential Wi-Fi changes and the relocation of power and IT connections for an office television were also pending field review.</w:t>
         <w:br/>
         <w:br/>
         <w:t>### 4. Products and Design Decisions</w:t>
         <w:br/>
         <w:br/>
-        <w:t>#### Quoted Products</w:t>
+        <w:t>#### Quoted Furniture Package</w:t>
         <w:br/>
         <w:br/>
-        <w:t>The supplied quote documents the following products:</w:t>
+        <w:t>The August 11, 2026 quote includes the following products:</w:t>
         <w:br/>
         <w:br/>
         <w:t>| Product | Quantity | Unit Price | Total |</w:t>
@@ -127,62 +124,73 @@
         <w:t>Final quantities and pricing remain subject to approval, and the quote notes that furniture selections may change during the final design review.</w:t>
         <w:br/>
         <w:br/>
-        <w:t>#### Proposed or Pending Design Decisions</w:t>
+        <w:t>#### Proposed Workstation Design</w:t>
         <w:br/>
         <w:br/>
-        <w:t>The following items were discussed but were not confirmed as final in the supplied materials:</w:t>
+        <w:t>The broader office design discussed during discovery and final review included:</w:t>
         <w:br/>
         <w:br/>
-        <w:t>- Approximately **90 sales workstations**, reduced from the approximately **105 seats** shown during final review.</w:t>
+        <w:t>- Compact sales workstations sized for two monitors and a notebook or limited paperwork.</w:t>
         <w:br/>
-        <w:t>- Lower workstation panels to maintain visibility across the office.</w:t>
+        <w:t>- Static work surfaces for the sales workstations rather than height-adjustable bases.</w:t>
         <w:br/>
-        <w:t>- Clear, frosted, or other glass stacker options above workstation panels.</w:t>
+        <w:t>- Mobile file cabinets as an adjustable scope item; COI noted that fewer could be purchased initially and additional units added later.</w:t>
         <w:br/>
-        <w:t>- Patriot’s darker blue and red brand colors within the executive-office concept.</w:t>
+        <w:t>- Monitor arms to improve ergonomics and preserve usable desk space. Although Patriot initially indicated that monitor arms were not required, the later design review stated that monitor arms would be included in the developed workstation concept.</w:t>
         <w:br/>
-        <w:t>- Dual-monitor capacity at workstations.</w:t>
+        <w:t>- Monitors themselves remained optional. Patriot requested pricing for approximately **200 monitors**, reflecting two monitors across the contemplated workstation and administrative areas. COI discussed an estimated cost of **$20,000 to $30,000**, depending on monitor style, but this was not included in the provided quote.</w:t>
         <w:br/>
-        <w:t>- Commercial-grade task chairs and monitor arms.</w:t>
+        <w:t>- Optional clear or frosted glass stackers above workstation panels. Removing glass was identified as a potential cost-reduction measure.</w:t>
         <w:br/>
-        <w:t>- Optional mobile storage at individual workstations.</w:t>
+        <w:t>- Lower panel heights to preserve visibility. The design shown at final review used a **50-inch panel with 10 inches of glass**, creating a five-foot overall height. Patriot considered that too high, and COI proposed reducing the panel height. No final panel or glass height was documented.</w:t>
         <w:br/>
-        <w:t>- Planters and greenery to break up long workstation rows.</w:t>
+        <w:t>- Optional taller panels without glass as another approach to sound mitigation.</w:t>
         <w:br/>
-        <w:t>- Sound masking for the open office and potentially near administrative spaces.</w:t>
         <w:br/>
-        <w:t>- Training-room tables and seating concepts.</w:t>
+        <w:t>#### Proposed Private Office and Administrative Concepts</w:t>
         <w:br/>
-        <w:t>- Approximately **200 monitors**, estimated during discussion at **$20,000 to $30,000 depending on style**. This remained under consideration and was not included in the supplied quote.</w:t>
         <w:br/>
-        <w:t>- Separate electrical and data services, pending an on-site assessment and additional pricing.</w:t>
+        <w:t>COI also presented concepts beyond the products specifically listed in the quote:</w:t>
         <w:br/>
-        <w:t>- Relocation and mounting of an existing office television, subject to confirming nearby power and data requirements.</w:t>
+        <w:br/>
+        <w:t>- A private executive office with a height-adjustable L-shaped desk, dark blue and red accents reflecting Patriot’s colors, a small round meeting table, wardrobe storage, filing space, tack boards, and guest seating options.</w:t>
+        <w:br/>
+        <w:t>- An administrative area with workspace storage, wardrobe space, monitor arms, and room for visitors to exchange documents or ask questions.</w:t>
+        <w:br/>
+        <w:t>- A small lounge concept with lounge chairs and planter-style bookcases near the kitchenette.</w:t>
+        <w:br/>
+        <w:t>- Training tables to be explored in a later design exercise; no final training-room capacity or product selection was confirmed.</w:t>
+        <w:br/>
+        <w:t>- Finish selections in gray, brown, and other coordinating tones, with the intent of avoiding wood finishes that could conflict with the existing floor. Final finishes were to be selected and applied to a final rendering.</w:t>
+        <w:br/>
+        <w:br/>
+        <w:t>These broader concepts were discussed as proposed or optional design elements and are not fully represented in the provided $12,900 quote.</w:t>
         <w:br/>
         <w:br/>
         <w:t>### 5. Project Results</w:t>
         <w:br/>
         <w:br/>
-        <w:t>The supplied information does not confirm that the Nashua office renovation has been completed. No documented installation results, final workstation count, completed photography, employee feedback, or measurable post-project outcomes were provided.</w:t>
+        <w:t>The provided information does not confirm that the Nashua office renovation was completed or installed. No post-installation results, final photographs, measured performance improvements, or completed-project outcomes were provided.</w:t>
         <w:br/>
         <w:br/>
-        <w:t>The available records reflect discovery, design development, final-review discussions, and a sample quote dated August 11, 2026.</w:t>
+        <w:t>At the documented stage, COI had developed design concepts, clarified the suite’s maximum occupancy, identified approximately 90 workstations as the revised planning direction, and issued a furniture quote for four private office desks, four mobile file cabinets, one conference room table, eight conference chairs, and estimated installation. Final product selections, broader workstation quantities, electrical and data scope, and several optional design features remained subject to review and approval.</w:t>
         <w:br/>
         <w:br/>
         <w:t>### 6. Key Takeaways</w:t>
         <w:br/>
         <w:br/>
-        <w:t>- Patriot’s primary objective was to replace oversized cubicles with smaller sales workstations that support two monitors and a notebook.</w:t>
+        <w:t>- Patriot sought to replace large existing cubicles with compact workstations suited to a sales office.</w:t>
         <w:br/>
-        <w:t>- The planning process evolved from a **130-workstation maximum-capacity concept** to an approximately **105-seat design**, with a potential reduction to **90 workstations** after the suite’s **110-person maximum occupancy** was confirmed.</w:t>
+        <w:t>- The planning direction changed after the building confirmed a maximum suite occupancy of **110 people**. A design containing **105 seats** was expected to be reduced by 15 stations, with approximately **90 workstations** identified as the more appropriate target after accounting for private offices and administrative personnel.</w:t>
         <w:br/>
-        <w:t>- COI proposed a connected tele-station layout to improve space efficiency and simplify power and data distribution.</w:t>
+        <w:t>- COI proposed straight tele-station layouts to support capacity, circulation, and more efficient power and data distribution.</w:t>
         <w:br/>
-        <w:t>- Visibility, circulation, acoustics, storage, technology, and installation logistics were important parts of the design discussion.</w:t>
+        <w:t>- Lower partitions, optional glass stackers, mobile storage, monitor arms, planters, and sound masking were considered as ways to balance visibility, function, acoustics, and budget.</w:t>
         <w:br/>
-        <w:t>- The supplied quote totals **$12,900.00** and includes four private office desks, four mobile file cabinets, one conference room table, eight conference chairs, and estimated installation.</w:t>
+        <w:t>- Data, electrical, monitor procurement, final finishes, and parts of the broader office-wide scope remained pending.</w:t>
         <w:br/>
-        <w:t>- The broader workstation package, decommissioning scope, sound masking, monitors, and electrical and data work remained subject to further design decisions, evaluation, pricing, and approval.</w:t>
+        <w:t>- The documented quote totals **$12,900.00** and covers a defined private-office and conference-room furniture package with estimated installation.</w:t>
+        <w:br/>
       </w:r>
     </w:p>
     <w:sectPr>

</xml_diff>